<commit_message>
fix(corpus): explicit end-to-end cuti process in HR-001 + tighten agent grounding
- HR-001: add numbered 'Proses Pengajuan Cuti End-to-End' section (HR Portal -> manager review maks 2 hari kerja -> HR update saldo & status -> notifikasi) so the agent grounds on explicit steps instead of embellishing the terse flow diagram
- generator: reconcile committed HR-002 eligibility-allowance prose into embedded spec so regenerate no longer overwrites it (HR-002.md diff empty)
- 101B: add anti-embellishment rule for process/flow questions to instructions template (matches live agent v7)

Validated: agent asisten-karyawan-contoso v7 + reindexed HR-001.pdf now answers the cuti end-to-end question with grounded 4 steps + citations, no HRIS/formulir/menu hallucination.
</commit_message>
<xml_diff>
--- a/sample-data/contoso-indonesia/docx/HR-001-kebijakan-cuti-2026.docx
+++ b/sample-data/contoso-indonesia/docx/HR-001-kebijakan-cuti-2026.docx
@@ -62,6 +62,36 @@
           <w:bCs w:val="false"/>
         </w:rPr>
         <w:t xml:space="preserve">Semua cuti harus diajukan melalui HR Portal. Manager wajib memberikan keputusan maksimal dua hari kerja setelah permintaan diterima, kecuali cuti sakit yang dilaporkan setelah kejadian.</w:t>
+      </w:r>
+    </w:p>
+    <w:p>
+      <w:pPr>
+        <w:pStyle w:val="Heading2"/>
+        <w:spacing w:after="80" w:before="80"/>
+      </w:pPr>
+      <w:r>
+        <w:rPr>
+          <w:b/>
+          <w:bCs/>
+        </w:rPr>
+        <w:t xml:space="preserve">Proses Pengajuan Cuti End-to-End</w:t>
+      </w:r>
+    </w:p>
+    <w:p>
+      <w:pPr>
+        <w:spacing w:after="80" w:before="80"/>
+      </w:pPr>
+      <w:r>
+        <w:rPr>
+          <w:b w:val="false"/>
+          <w:bCs w:val="false"/>
+        </w:rPr>
+        <w:t xml:space="preserve">Alur pengajuan cuti berjalan end-to-end sebagai berikut:
+1. Karyawan mengajukan cuti melalui HR Portal dengan memilih jenis cuti serta tanggal mulai dan tanggal selesai.
+2. Manager melakukan review dan memberikan keputusan (setuju atau tolak) maksimal dua hari kerja setelah permintaan diterima.
+3. Setelah disetujui, HR memperbarui saldo cuti dan status pengajuan pada sistem.
+4. Sistem mengirim notifikasi hasil pengajuan ke karyawan.
+Pengecualian: cuti sakit dapat dilaporkan pada hari H setelah kejadian, dan cuti sakit lebih dari satu hari memerlukan surat dokter.</w:t>
       </w:r>
     </w:p>
     <w:p>

</xml_diff>